<commit_message>
licencias y estructura capitulos
</commit_message>
<xml_diff>
--- a/Thesis_DCT/Portada_Contraportada/tesis-compendio-autorizacion-coautores-no-doctores_en.docx
+++ b/Thesis_DCT/Portada_Contraportada/tesis-compendio-autorizacion-coautores-no-doctores_en.docx
@@ -261,7 +261,6 @@
           <w:placeholder>
             <w:docPart w:val="6971AF84943D435FBB6CD301586DDAED"/>
           </w:placeholder>
-          <w:showingPlcHdr/>
         </w:sdtPr>
         <w:sdtEndPr>
           <w:rPr>
@@ -272,30 +271,35 @@
           </w:rPr>
         </w:sdtEndPr>
         <w:sdtContent>
-          <w:r>
-            <w:rPr>
-              <w:rStyle w:val="Textodelmarcadordeposicin"/>
-              <w:rFonts w:ascii="Aptos" w:hAnsi="Aptos"/>
-              <w:color w:val="auto"/>
-              <w:sz w:val="24"/>
-              <w:szCs w:val="24"/>
-              <w:highlight w:val="lightGray"/>
-              <w:lang w:val="en-US"/>
-            </w:rPr>
-            <w:t>T</w:t>
-          </w:r>
-          <w:r>
-            <w:rPr>
-              <w:rStyle w:val="Textodelmarcadordeposicin"/>
-              <w:rFonts w:ascii="Aptos" w:hAnsi="Aptos"/>
-              <w:color w:val="auto"/>
-              <w:sz w:val="24"/>
-              <w:szCs w:val="24"/>
-              <w:highlight w:val="lightGray"/>
-              <w:lang w:val="en-US"/>
-            </w:rPr>
-            <w:t>itle of the thesis in the language it will be presented</w:t>
-          </w:r>
+          <w:sdt>
+            <w:sdtPr>
+              <w:rPr>
+                <w:rStyle w:val="Estilo5"/>
+                <w:szCs w:val="24"/>
+              </w:rPr>
+              <w:id w:val="-624078328"/>
+              <w:placeholder>
+                <w:docPart w:val="F4C5DEEB0D64BF4895B44BDE73A5DFF9"/>
+              </w:placeholder>
+            </w:sdtPr>
+            <w:sdtEndPr>
+              <w:rPr>
+                <w:rStyle w:val="Fuentedeprrafopredeter"/>
+                <w:rFonts w:cstheme="minorHAnsi"/>
+                <w:sz w:val="22"/>
+              </w:rPr>
+            </w:sdtEndPr>
+            <w:sdtContent>
+              <w:r>
+                <w:rPr>
+                  <w:rStyle w:val="Estilo5"/>
+                  <w:szCs w:val="24"/>
+                  <w:lang w:val="en-US"/>
+                </w:rPr>
+                <w:t>Antimicrobial Peptides at Membrane Interfaces: Classical and Quantum Approaches to Environment-Conditioned Peptide Design</w:t>
+              </w:r>
+            </w:sdtContent>
+          </w:sdt>
         </w:sdtContent>
       </w:sdt>
       <w:r>
@@ -337,11 +341,6 @@
     </w:p>
     <w:p>
       <w:pPr>
-        <w:pStyle w:val="Prrafodelista"/>
-        <w:numPr>
-          <w:ilvl w:val="0"/>
-          <w:numId w:val="1"/>
-        </w:numPr>
         <w:rPr>
           <w:rFonts w:ascii="Aptos" w:hAnsi="Aptos"/>
           <w:i/>
@@ -351,68 +350,135 @@
           <w:lang w:val="en-US"/>
         </w:rPr>
       </w:pPr>
-      <w:sdt>
-        <w:sdtPr>
-          <w:rPr>
-            <w:rStyle w:val="Estilo6"/>
-          </w:rPr>
-          <w:id w:val="-1328583775"/>
-          <w:placeholder>
-            <w:docPart w:val="93A2F5EA921B4B8DAB9D9E0C2234E71E"/>
-          </w:placeholder>
-        </w:sdtPr>
-        <w:sdtEndPr>
-          <w:rPr>
-            <w:rStyle w:val="Fuentedeprrafopredeter"/>
-            <w:rFonts w:asciiTheme="minorHAnsi" w:hAnsiTheme="minorHAnsi"/>
-            <w:sz w:val="22"/>
-            <w:szCs w:val="24"/>
-          </w:rPr>
-        </w:sdtEndPr>
-        <w:sdtContent>
-          <w:r>
-            <w:rPr>
-              <w:rStyle w:val="Estilo6"/>
-              <w:lang w:val="en-US"/>
-            </w:rPr>
-            <w:t>Unraveling lipid and inflammation interplay in cancer, aging</w:t>
-          </w:r>
-          <w:r>
-            <w:rPr>
-              <w:rStyle w:val="Estilo6"/>
-              <w:lang w:val="en-US"/>
-            </w:rPr>
-            <w:t xml:space="preserve"> and infection for novel </w:t>
-          </w:r>
-          <w:proofErr w:type="spellStart"/>
-          <w:r>
-            <w:rPr>
-              <w:rStyle w:val="Estilo6"/>
-              <w:lang w:val="en-US"/>
-            </w:rPr>
-            <w:t>theranostic</w:t>
-          </w:r>
-          <w:proofErr w:type="spellEnd"/>
-          <w:r>
-            <w:rPr>
-              <w:rStyle w:val="Estilo6"/>
-              <w:lang w:val="en-US"/>
-            </w:rPr>
-            <w:t xml:space="preserve"> approaches</w:t>
-          </w:r>
-        </w:sdtContent>
-      </w:sdt>
-    </w:p>
-    <w:p>
-      <w:pPr>
-        <w:rPr>
-          <w:rFonts w:ascii="Aptos" w:hAnsi="Aptos"/>
+      <w:r>
+        <w:rPr>
+          <w:sz w:val="24"/>
+          <w:szCs w:val="24"/>
+        </w:rPr>
+        <w:t>-</w:t>
+      </w:r>
+      <w:r>
+        <w:rPr>
+          <w:sz w:val="24"/>
+          <w:szCs w:val="24"/>
+        </w:rPr>
+        <w:t xml:space="preserve">Conde-Torres, D., </w:t>
+      </w:r>
+      <w:r>
+        <w:rPr>
           <w:i/>
           <w:iCs/>
           <w:sz w:val="24"/>
           <w:szCs w:val="24"/>
         </w:rPr>
-      </w:pPr>
+        <w:t>et al.</w:t>
+      </w:r>
+      <w:r>
+        <w:rPr>
+          <w:sz w:val="24"/>
+          <w:szCs w:val="24"/>
+        </w:rPr>
+        <w:t xml:space="preserve"> </w:t>
+      </w:r>
+      <w:r>
+        <w:rPr>
+          <w:sz w:val="24"/>
+          <w:szCs w:val="24"/>
+          <w:lang w:val="en-US"/>
+        </w:rPr>
+        <w:t xml:space="preserve">Unraveling lipid and inflammation interplay in cancer, aging and infection for novel </w:t>
+      </w:r>
+      <w:proofErr w:type="spellStart"/>
+      <w:r>
+        <w:rPr>
+          <w:sz w:val="24"/>
+          <w:szCs w:val="24"/>
+          <w:lang w:val="en-US"/>
+        </w:rPr>
+        <w:t>theranostic</w:t>
+      </w:r>
+      <w:proofErr w:type="spellEnd"/>
+      <w:r>
+        <w:rPr>
+          <w:sz w:val="24"/>
+          <w:szCs w:val="24"/>
+          <w:lang w:val="en-US"/>
+        </w:rPr>
+        <w:t xml:space="preserve"> approaches. </w:t>
+      </w:r>
+      <w:r>
+        <w:rPr>
+          <w:i/>
+          <w:iCs/>
+          <w:sz w:val="24"/>
+          <w:szCs w:val="24"/>
+          <w:lang w:val="en-US"/>
+        </w:rPr>
+        <w:t>Frontiers in Immunology</w:t>
+      </w:r>
+      <w:r>
+        <w:rPr>
+          <w:sz w:val="24"/>
+          <w:szCs w:val="24"/>
+          <w:lang w:val="en-US"/>
+        </w:rPr>
+        <w:t xml:space="preserve"> </w:t>
+      </w:r>
+      <w:r>
+        <w:rPr>
+          <w:b/>
+          <w:bCs/>
+          <w:sz w:val="24"/>
+          <w:szCs w:val="24"/>
+          <w:lang w:val="en-US"/>
+        </w:rPr>
+        <w:t>15</w:t>
+      </w:r>
+      <w:r>
+        <w:rPr>
+          <w:sz w:val="24"/>
+          <w:szCs w:val="24"/>
+          <w:lang w:val="en-US"/>
+        </w:rPr>
+        <w:t xml:space="preserve">, 1320779 (2024). </w:t>
+      </w:r>
+      <w:proofErr w:type="spellStart"/>
+      <w:r>
+        <w:rPr>
+          <w:sz w:val="24"/>
+          <w:szCs w:val="24"/>
+          <w:lang w:val="en-US"/>
+        </w:rPr>
+        <w:t>doi</w:t>
+      </w:r>
+      <w:proofErr w:type="spellEnd"/>
+      <w:r>
+        <w:rPr>
+          <w:sz w:val="24"/>
+          <w:szCs w:val="24"/>
+          <w:lang w:val="en-US"/>
+        </w:rPr>
+        <w:t xml:space="preserve">: </w:t>
+      </w:r>
+      <w:hyperlink r:id="rId7" w:history="1">
+        <w:r>
+          <w:rPr>
+            <w:rStyle w:val="Hipervnculo"/>
+            <w:sz w:val="24"/>
+            <w:szCs w:val="24"/>
+            <w:lang w:val="en-US"/>
+          </w:rPr>
+          <w:t>10.3389/fimmu.2024.1320779</w:t>
+        </w:r>
+      </w:hyperlink>
+      <w:r>
+        <w:rPr>
+          <w:sz w:val="24"/>
+          <w:szCs w:val="24"/>
+          <w:lang w:val="en-US"/>
+        </w:rPr>
+        <w:t>.</w:t>
+      </w:r>
     </w:p>
     <w:p>
       <w:pPr>
@@ -797,7 +863,16 @@
               <w:highlight w:val="lightGray"/>
               <w:lang w:val="en-US"/>
             </w:rPr>
-            <w:t xml:space="preserve"> R</w:t>
+            <w:t xml:space="preserve"> </w:t>
+          </w:r>
+          <w:proofErr w:type="spellStart"/>
+          <w:r>
+            <w:rPr>
+              <w:rStyle w:val="Estilo6"/>
+              <w:highlight w:val="lightGray"/>
+              <w:lang w:val="en-US"/>
+            </w:rPr>
+            <w:t>R</w:t>
           </w:r>
           <w:r>
             <w:rPr>
@@ -807,6 +882,7 @@
             </w:rPr>
             <w:t>iveiro</w:t>
           </w:r>
+          <w:proofErr w:type="spellEnd"/>
         </w:sdtContent>
       </w:sdt>
       <w:r>
@@ -820,7 +896,7 @@
       </w:r>
     </w:p>
     <w:sectPr>
-      <w:headerReference w:type="default" r:id="rId7"/>
+      <w:headerReference w:type="default" r:id="rId8"/>
       <w:pgSz w:w="11906" w:h="16838"/>
       <w:pgMar w:top="1985" w:right="1701" w:bottom="1417" w:left="1701" w:header="708" w:footer="708" w:gutter="0"/>
       <w:cols w:space="708"/>
@@ -2247,6 +2323,17 @@
       </w:tblBorders>
     </w:tblPr>
   </w:style>
+  <w:style w:type="character" w:styleId="Hipervnculo">
+    <w:name w:val="Hyperlink"/>
+    <w:basedOn w:val="Fuentedeprrafopredeter"/>
+    <w:uiPriority w:val="99"/>
+    <w:unhideWhenUsed/>
+    <w:rsid w:val="00003721"/>
+    <w:rPr>
+      <w:color w:val="0563C1" w:themeColor="hyperlink"/>
+      <w:u w:val="single"/>
+    </w:rPr>
+  </w:style>
 </w:styles>
 </file>
 
@@ -2473,9 +2560,9 @@
     </w:docPart>
     <w:docPart>
       <w:docPartPr>
-        <w:name w:val="93A2F5EA921B4B8DAB9D9E0C2234E71E"/>
+        <w:name w:val="F4C5DEEB0D64BF4895B44BDE73A5DFF9"/>
         <w:category>
-          <w:name w:val="Xeral"/>
+          <w:name w:val="General"/>
           <w:gallery w:val="placeholder"/>
         </w:category>
         <w:types>
@@ -2484,32 +2571,21 @@
         <w:behaviors>
           <w:behavior w:val="content"/>
         </w:behaviors>
-        <w:guid w:val="{30914C41-5311-4DB4-9379-C4AD968E2ADD}"/>
+        <w:guid w:val="{DB452EAA-8AD6-0148-B894-0B427BB2F22A}"/>
       </w:docPartPr>
       <w:docPartBody>
         <w:p>
           <w:pPr>
-            <w:pStyle w:val="93A2F5EA921B4B8DAB9D9E0C2234E71E"/>
+            <w:pStyle w:val="F4C5DEEB0D64BF4895B44BDE73A5DFF9"/>
           </w:pPr>
           <w:r>
             <w:rPr>
               <w:rStyle w:val="Textodelmarcadordeposicin"/>
               <w:rFonts w:ascii="Aptos" w:hAnsi="Aptos"/>
-              <w:sz w:val="24"/>
-              <w:szCs w:val="24"/>
               <w:highlight w:val="lightGray"/>
+              <w:lang w:val="en-US"/>
             </w:rPr>
-            <w:t>T</w:t>
-          </w:r>
-          <w:r>
-            <w:rPr>
-              <w:rStyle w:val="Textodelmarcadordeposicin"/>
-              <w:rFonts w:ascii="Aptos" w:hAnsi="Aptos"/>
-              <w:sz w:val="24"/>
-              <w:szCs w:val="24"/>
-              <w:highlight w:val="lightGray"/>
-            </w:rPr>
-            <w:t>itle of article 1</w:t>
+            <w:t>Title of the thesis</w:t>
           </w:r>
         </w:p>
       </w:docPartBody>
@@ -2543,15 +2619,15 @@
   </w:font>
   <w:font w:name="Wingdings">
     <w:panose1 w:val="05000000000000000000"/>
-    <w:charset w:val="02"/>
-    <w:family w:val="auto"/>
+    <w:charset w:val="4D"/>
+    <w:family w:val="decorative"/>
     <w:pitch w:val="variable"/>
-    <w:sig w:usb0="00000000" w:usb1="10000000" w:usb2="00000000" w:usb3="00000000" w:csb0="80000000" w:csb1="00000000"/>
+    <w:sig w:usb0="00000003" w:usb1="00000000" w:usb2="00000000" w:usb3="00000000" w:csb0="80000001" w:csb1="00000000"/>
   </w:font>
   <w:font w:name="Symbol">
     <w:panose1 w:val="05050102010706020507"/>
     <w:charset w:val="02"/>
-    <w:family w:val="roman"/>
+    <w:family w:val="decorative"/>
     <w:pitch w:val="variable"/>
     <w:sig w:usb0="00000000" w:usb1="10000000" w:usb2="00000000" w:usb3="00000000" w:csb0="80000000" w:csb1="00000000"/>
   </w:font>
@@ -2560,7 +2636,7 @@
     <w:charset w:val="00"/>
     <w:family w:val="swiss"/>
     <w:pitch w:val="variable"/>
-    <w:sig w:usb0="E4002EFF" w:usb1="C000247B" w:usb2="00000009" w:usb3="00000000" w:csb0="000001FF" w:csb1="00000000"/>
+    <w:sig w:usb0="E0002AFF" w:usb1="C000247B" w:usb2="00000009" w:usb3="00000000" w:csb0="000001FF" w:csb1="00000000"/>
   </w:font>
   <w:font w:name="Aptos">
     <w:panose1 w:val="020B0004020202020204"/>
@@ -2597,7 +2673,9 @@
   <w:rsids>
     <w:rsidRoot w:val="00007D45"/>
     <w:rsid w:val="00007D45"/>
+    <w:rsid w:val="00174F72"/>
     <w:rsid w:val="001F13D6"/>
+    <w:rsid w:val="00225398"/>
     <w:rsid w:val="003479A1"/>
     <w:rsid w:val="00353CA1"/>
     <w:rsid w:val="00771073"/>
@@ -2605,6 +2683,7 @@
     <w:rsid w:val="008A7B2D"/>
     <w:rsid w:val="008F6F2F"/>
     <w:rsid w:val="00915F3A"/>
+    <w:rsid w:val="00D5783B"/>
     <w:rsid w:val="00D964DF"/>
     <w:rsid w:val="00E8340C"/>
     <w:rsid w:val="00EB38FD"/>
@@ -3064,7 +3143,7 @@
     <w:basedOn w:val="Fuentedeprrafopredeter"/>
     <w:uiPriority w:val="99"/>
     <w:semiHidden/>
-    <w:rsid w:val="008A7B2D"/>
+    <w:rsid w:val="00225398"/>
     <w:rPr>
       <w:color w:val="666666"/>
     </w:rPr>
@@ -3131,21 +3210,11 @@
       <w14:ligatures w14:val="none"/>
     </w:rPr>
   </w:style>
-  <w:style w:type="paragraph" w:customStyle="1" w:styleId="7C09FCD8DD1F496092889F7A8735DB60">
-    <w:name w:val="7C09FCD8DD1F496092889F7A8735DB60"/>
-    <w:rsid w:val="008A7B2D"/>
-    <w:pPr>
-      <w:spacing w:line="259" w:lineRule="auto"/>
-      <w:ind w:left="720"/>
-      <w:contextualSpacing/>
-    </w:pPr>
-    <w:rPr>
-      <w:rFonts w:eastAsiaTheme="minorHAnsi"/>
-      <w:kern w:val="0"/>
-      <w:sz w:val="22"/>
-      <w:szCs w:val="22"/>
-      <w:lang w:eastAsia="en-US"/>
-      <w14:ligatures w14:val="none"/>
+  <w:style w:type="paragraph" w:customStyle="1" w:styleId="F4C5DEEB0D64BF4895B44BDE73A5DFF9">
+    <w:name w:val="F4C5DEEB0D64BF4895B44BDE73A5DFF9"/>
+    <w:rsid w:val="00225398"/>
+    <w:rPr>
+      <w:lang w:eastAsia="es-ES_tradnl"/>
     </w:rPr>
   </w:style>
   <w:style w:type="paragraph" w:customStyle="1" w:styleId="05AF9A8CD4724C169767C0CCC96956A2">

</xml_diff>